<commit_message>
Add human health research direction to project vision
</commit_message>
<xml_diff>
--- a/docs/Warrigal_Research_Suite_Project_Vision.docx
+++ b/docs/Warrigal_Research_Suite_Project_Vision.docx
@@ -275,6 +275,35 @@
     <w:p>
       <w:r>
         <w:t>A Workshop Log should retain practical work that does not fit neatly into a literature review: what was built or tested, materials and settings, dated observations, changes between iterations, images or measurements, and what the result suggests. This makes hands-on work part of the research record rather than an unconnected set of notes.</w:t>
+      </w:r>
+    </w:p>
+    <w:p>
+      <w:pPr>
+        <w:pStyle w:val="Heading2"/>
+        <w:keepNext/>
+      </w:pPr>
+      <w:r>
+        <w:t>Human health research and future reference laboratory</w:t>
+      </w:r>
+    </w:p>
+    <w:p>
+      <w:r>
+        <w:t>Human health is a major research direction for Warrigal Research Suite. It draws on biology and human biomolecular science to investigate disease across anatomy, embryonic and tissue development, cells, genes, microorganisms, viruses and the methods used to study them. A health investigation should be able to move between a person’s experience, observable features, laboratory findings and the underlying biological questions without assuming that any one source supplies a complete explanation.</w:t>
+      </w:r>
+    </w:p>
+    <w:p>
+      <w:r>
+        <w:t>Warrigal should support voluntary, consent-based case studies in which a health question can be investigated systematically. A case study would bring together the participant’s account, relevant existing records, research literature, observations, laboratory findings and the methods used to obtain them. It would record what the evidence supports, what it cannot establish, conflicting results and questions for further investigation. Identity and health information would require controls appropriate to the research.</w:t>
+      </w:r>
+    </w:p>
+    <w:p>
+      <w:r>
+        <w:t>A future reference laboratory or laboratory partnership could add the ability to examine specimens, evaluate testing methods and produce reproducible findings for defined research questions. That direction should develop through qualified collaborators, suitable facilities, validated methods, quality systems and appropriate ethics and governance arrangements. Warrigal would connect the research question, consent, sample history, methods, controls, results and interpretation so the work remains traceable.</w:t>
+      </w:r>
+    </w:p>
+    <w:p>
+      <w:r>
+        <w:t>The long-term aim is a research pathway for people whose health questions merit deeper investigation, including questions that current services have not resolved. Participation would be voluntary. The work would be designed to generate reliable evidence and new research questions, with any clinical testing or patient-care role defined separately as that capability develops.</w:t>
       </w:r>
     </w:p>
     <w:p>
@@ -558,7 +587,7 @@
     <w:sectPr>
       <w:footerReference w:type="default" r:id="rId9"/>
       <w:pgSz w:w="12240" w:h="15840"/>
-      <w:pgMar w:top="1123" w:right="1296" w:bottom="1080" w:left="1296" w:header="720" w:footer="720" w:gutter="0"/>
+      <w:pgMar w:top="1037" w:right="1296" w:bottom="979" w:left="1296" w:header="720" w:footer="720" w:gutter="0"/>
       <w:cols w:space="720"/>
       <w:docGrid w:linePitch="360"/>
     </w:sectPr>
@@ -949,7 +978,7 @@
     <w:qFormat/>
     <w:rsid w:val="00FC693F"/>
     <w:pPr>
-      <w:spacing w:before="0" w:after="120" w:line="271" w:lineRule="auto"/>
+      <w:spacing w:before="0" w:after="100" w:line="264" w:lineRule="auto"/>
     </w:pPr>
     <w:rPr>
       <w:rFonts w:ascii="Aptos" w:hAnsi="Aptos"/>
@@ -1013,7 +1042,7 @@
     <w:pPr>
       <w:keepNext/>
       <w:keepLines/>
-      <w:spacing w:before="360" w:after="140"/>
+      <w:spacing w:before="320" w:after="120"/>
       <w:outlineLvl w:val="0"/>
     </w:pPr>
     <w:rPr>
@@ -1037,7 +1066,7 @@
     <w:pPr>
       <w:keepNext/>
       <w:keepLines/>
-      <w:spacing w:before="240" w:after="100"/>
+      <w:spacing w:before="220" w:after="80"/>
       <w:outlineLvl w:val="1"/>
     </w:pPr>
     <w:rPr>

</xml_diff>

<commit_message>
Restore original Warrigal project vision for health section review
</commit_message>
<xml_diff>
--- a/docs/Warrigal_Research_Suite_Project_Vision.docx
+++ b/docs/Warrigal_Research_Suite_Project_Vision.docx
@@ -275,35 +275,6 @@
     <w:p>
       <w:r>
         <w:t>A Workshop Log should retain practical work that does not fit neatly into a literature review: what was built or tested, materials and settings, dated observations, changes between iterations, images or measurements, and what the result suggests. This makes hands-on work part of the research record rather than an unconnected set of notes.</w:t>
-      </w:r>
-    </w:p>
-    <w:p>
-      <w:pPr>
-        <w:pStyle w:val="Heading2"/>
-        <w:keepNext/>
-      </w:pPr>
-      <w:r>
-        <w:t>Human health research and future reference laboratory</w:t>
-      </w:r>
-    </w:p>
-    <w:p>
-      <w:r>
-        <w:t>Human health is a major research direction for Warrigal Research Suite. It draws on biology and human biomolecular science to investigate disease across anatomy, embryonic and tissue development, cells, genes, microorganisms, viruses and the methods used to study them. A health investigation should be able to move between a person’s experience, observable features, laboratory findings and the underlying biological questions without assuming that any one source supplies a complete explanation.</w:t>
-      </w:r>
-    </w:p>
-    <w:p>
-      <w:r>
-        <w:t>Warrigal should support voluntary, consent-based case studies in which a health question can be investigated systematically. A case study would bring together the participant’s account, relevant existing records, research literature, observations, laboratory findings and the methods used to obtain them. It would record what the evidence supports, what it cannot establish, conflicting results and questions for further investigation. Identity and health information would require controls appropriate to the research.</w:t>
-      </w:r>
-    </w:p>
-    <w:p>
-      <w:r>
-        <w:t>A future reference laboratory or laboratory partnership could add the ability to examine specimens, evaluate testing methods and produce reproducible findings for defined research questions. That direction should develop through qualified collaborators, suitable facilities, validated methods, quality systems and appropriate ethics and governance arrangements. Warrigal would connect the research question, consent, sample history, methods, controls, results and interpretation so the work remains traceable.</w:t>
-      </w:r>
-    </w:p>
-    <w:p>
-      <w:r>
-        <w:t>The long-term aim is a research pathway for people whose health questions merit deeper investigation, including questions that current services have not resolved. Participation would be voluntary. The work would be designed to generate reliable evidence and new research questions, with any clinical testing or patient-care role defined separately as that capability develops.</w:t>
       </w:r>
     </w:p>
     <w:p>
@@ -587,7 +558,7 @@
     <w:sectPr>
       <w:footerReference w:type="default" r:id="rId9"/>
       <w:pgSz w:w="12240" w:h="15840"/>
-      <w:pgMar w:top="1037" w:right="1296" w:bottom="979" w:left="1296" w:header="720" w:footer="720" w:gutter="0"/>
+      <w:pgMar w:top="1123" w:right="1296" w:bottom="1080" w:left="1296" w:header="720" w:footer="720" w:gutter="0"/>
       <w:cols w:space="720"/>
       <w:docGrid w:linePitch="360"/>
     </w:sectPr>
@@ -978,7 +949,7 @@
     <w:qFormat/>
     <w:rsid w:val="00FC693F"/>
     <w:pPr>
-      <w:spacing w:before="0" w:after="100" w:line="264" w:lineRule="auto"/>
+      <w:spacing w:before="0" w:after="120" w:line="271" w:lineRule="auto"/>
     </w:pPr>
     <w:rPr>
       <w:rFonts w:ascii="Aptos" w:hAnsi="Aptos"/>
@@ -1042,7 +1013,7 @@
     <w:pPr>
       <w:keepNext/>
       <w:keepLines/>
-      <w:spacing w:before="320" w:after="120"/>
+      <w:spacing w:before="360" w:after="140"/>
       <w:outlineLvl w:val="0"/>
     </w:pPr>
     <w:rPr>
@@ -1066,7 +1037,7 @@
     <w:pPr>
       <w:keepNext/>
       <w:keepLines/>
-      <w:spacing w:before="220" w:after="80"/>
+      <w:spacing w:before="240" w:after="100"/>
       <w:outlineLvl w:val="1"/>
     </w:pPr>
     <w:rPr>

</xml_diff>

<commit_message>
Expand Warrigal vision with plant and human health research
</commit_message>
<xml_diff>
--- a/docs/Warrigal_Research_Suite_Project_Vision.docx
+++ b/docs/Warrigal_Research_Suite_Project_Vision.docx
@@ -255,6 +255,62 @@
         <w:keepNext/>
       </w:pPr>
       <w:r>
+        <w:t>Plant research</w:t>
+      </w:r>
+    </w:p>
+    <w:p>
+      <w:r>
+        <w:t>Plant research should have its own place alongside the Mushroom Lab. The suite should support botany, native plant and ecological research, cultivation, plant chemistry, and questions about relationships among plants, fungi, microbes, environments and human use. It should not treat a plant as a mushroom record with a different label.</w:t>
+      </w:r>
+    </w:p>
+    <w:p>
+      <w:r>
+        <w:t>A plant investigation might begin with a field observation, a specimen or image, a cultivation trial, a chemical constituent, a biological interaction or a question from the literature. It should be possible to follow that inquiry from identification and context through methods, repeated observations, evidence comparisons and practical outcomes.</w:t>
+      </w:r>
+    </w:p>
+    <w:p>
+      <w:pPr>
+        <w:pStyle w:val="ListBullet"/>
+      </w:pPr>
+      <w:r>
+        <w:t>Field and identification records: location and habitat when appropriate, date, images, morphological features, candidate identifications, comparisons, confidence and later revisions.</w:t>
+      </w:r>
+    </w:p>
+    <w:p>
+      <w:pPr>
+        <w:pStyle w:val="ListBullet"/>
+      </w:pPr>
+      <w:r>
+        <w:t>Growth and ecology: conditions, developmental stage, seasonal changes, associations with other organisms, interventions, measurements and repeated observations.</w:t>
+      </w:r>
+    </w:p>
+    <w:p>
+      <w:pPr>
+        <w:pStyle w:val="ListBullet"/>
+      </w:pPr>
+      <w:r>
+        <w:t>Chemistry and human relevance: source-linked research on constituents, preparation or extraction methods, biological activity and uncertainty, without treating a traditional use or preliminary study as clinical proof.</w:t>
+      </w:r>
+    </w:p>
+    <w:p>
+      <w:pPr>
+        <w:pStyle w:val="ListBullet"/>
+      </w:pPr>
+      <w:r>
+        <w:t>Practical work: cultivation, propagation, materials or ecological experiments linked to the relevant project, method and results.</w:t>
+      </w:r>
+    </w:p>
+    <w:p>
+      <w:r>
+        <w:t>Mycology and plant research should be able to connect when an investigation calls for it, such as ecological interactions or shared field work. Each still needs records suited to its organism, methods and questions.</w:t>
+      </w:r>
+    </w:p>
+    <w:p>
+      <w:pPr>
+        <w:pStyle w:val="Heading2"/>
+        <w:keepNext/>
+      </w:pPr>
+      <w:r>
         <w:t>Biology and chemistry</w:t>
       </w:r>
     </w:p>
@@ -283,7 +339,252 @@
         <w:keepNext/>
       </w:pPr>
       <w:r>
-        <w:t>5 Mathematical, sequence, audio and visual tools</w:t>
+        <w:t>5 Human health research and future reference laboratory</w:t>
+      </w:r>
+    </w:p>
+    <w:p>
+      <w:r>
+        <w:t>Human health is a major research direction for Warrigal Research Suite. It draws on biology and human biomolecular science to investigate disease across the person, anatomy, embryonic and tissue development, cells, genes, proteins, microorganisms, viruses and the methods used to study them. The purpose is to move between those levels in a single investigation while keeping the evidence for each connection visible.</w:t>
+      </w:r>
+    </w:p>
+    <w:p>
+      <w:r>
+        <w:t>A project may begin with an unresolved health question, an observed feature, a tissue finding, an organism, a viral mechanism, a genetic question or an unusual laboratory result. Warrigal should help define the question, examine existing research, distinguish observations from interpretations, compare possible mechanisms and identify what evidence could clarify the uncertainty.</w:t>
+      </w:r>
+    </w:p>
+    <w:p>
+      <w:pPr>
+        <w:pStyle w:val="Heading2"/>
+        <w:keepNext/>
+      </w:pPr>
+      <w:r>
+        <w:t>Human health research projects</w:t>
+      </w:r>
+    </w:p>
+    <w:p>
+      <w:r>
+        <w:t>A health research project is the working record for a question and its development. It is broader than a patient file and more structured than a folder of papers. It should be able to connect the following parts without forcing them into one kind of evidence:</w:t>
+      </w:r>
+    </w:p>
+    <w:p>
+      <w:pPr>
+        <w:pStyle w:val="ListBullet"/>
+      </w:pPr>
+      <w:r>
+        <w:t>The question and its history: what prompted the investigation, how the question changed, and what remains unresolved.</w:t>
+      </w:r>
+    </w:p>
+    <w:p>
+      <w:pPr>
+        <w:pStyle w:val="ListBullet"/>
+      </w:pPr>
+      <w:r>
+        <w:t>Biological context: relevant anatomy, tissue changes, development, physiology, cellular pathways, genetics, microbiology and virology.</w:t>
+      </w:r>
+    </w:p>
+    <w:p>
+      <w:pPr>
+        <w:pStyle w:val="ListBullet"/>
+      </w:pPr>
+      <w:r>
+        <w:t>Published research: findings, methods, study populations, controls, limitations and the exact source behind each claim.</w:t>
+      </w:r>
+    </w:p>
+    <w:p>
+      <w:pPr>
+        <w:pStyle w:val="ListBullet"/>
+      </w:pPr>
+      <w:r>
+        <w:t>Observations and data: dated observations, measurements and existing records, with their origins and gaps made clear.</w:t>
+      </w:r>
+    </w:p>
+    <w:p>
+      <w:pPr>
+        <w:pStyle w:val="ListBullet"/>
+      </w:pPr>
+      <w:r>
+        <w:t>Possible explanations: what each accounts for, what supports or challenges it, and what result might distinguish alternatives.</w:t>
+      </w:r>
+    </w:p>
+    <w:p>
+      <w:pPr>
+        <w:pStyle w:val="ListBullet"/>
+      </w:pPr>
+      <w:r>
+        <w:t>Methods and results: analyses or laboratory work, including samples where appropriate, controls, quality concerns, findings and interpretation.</w:t>
+      </w:r>
+    </w:p>
+    <w:p>
+      <w:pPr>
+        <w:pStyle w:val="ListBullet"/>
+      </w:pPr>
+      <w:r>
+        <w:t>Next steps and outputs: research questions, collaborator review, case studies and reports grounded in the recorded work.</w:t>
+      </w:r>
+    </w:p>
+    <w:p>
+      <w:r>
+        <w:t>This structure can support microbiology, viruses and viral pathogenesis, disease mechanisms, anatomy, tissue development, molecular biology, genetics and gene-editing research. Those areas need usable scientific relationships, not merely tags attached to documents.</w:t>
+      </w:r>
+    </w:p>
+    <w:p>
+      <w:pPr>
+        <w:pStyle w:val="Heading2"/>
+        <w:keepNext/>
+      </w:pPr>
+      <w:r>
+        <w:t>Voluntary case investigations</w:t>
+      </w:r>
+    </w:p>
+    <w:p>
+      <w:r>
+        <w:t>A person with an unresolved health question could choose to participate in a structured research investigation. The aim is to gather and examine evidence carefully, including laboratory evidence where appropriate, and state what can and cannot be concluded. Participation should be voluntary and based on a defined research purpose. The research process does not promise a diagnosis or replace a person’s existing care.</w:t>
+      </w:r>
+    </w:p>
+    <w:p>
+      <w:pPr>
+        <w:pStyle w:val="Heading3"/>
+        <w:keepNext/>
+      </w:pPr>
+      <w:r>
+        <w:t>Define the question and participation</w:t>
+      </w:r>
+    </w:p>
+    <w:p>
+      <w:r>
+        <w:t>Record what the participant wants investigated, what the research proposes to do, what information or specimens may be involved, how results may be handled and the limits of the investigation. Consent and access decisions should be recorded as part of the study, not detached from its data.</w:t>
+      </w:r>
+    </w:p>
+    <w:p>
+      <w:pPr>
+        <w:pStyle w:val="Heading3"/>
+        <w:keepNext/>
+      </w:pPr>
+      <w:r>
+        <w:t>Assemble existing evidence</w:t>
+      </w:r>
+    </w:p>
+    <w:p>
+      <w:r>
+        <w:t>Organise the participant’s account, existing records, earlier tests, dated observations and relevant literature. Preserve contradictory and inconclusive findings. A result should retain the method, timing and context in which it was obtained.</w:t>
+      </w:r>
+    </w:p>
+    <w:p>
+      <w:pPr>
+        <w:pStyle w:val="Heading3"/>
+        <w:keepNext/>
+      </w:pPr>
+      <w:r>
+        <w:t>Develop testable possibilities</w:t>
+      </w:r>
+    </w:p>
+    <w:p>
+      <w:r>
+        <w:t>Connect possible biological explanations to observations they might account for. Record assumptions and alternative explanations. Specify what further observation, analysis or specialist review could support or weaken each possibility.</w:t>
+      </w:r>
+    </w:p>
+    <w:p>
+      <w:pPr>
+        <w:pStyle w:val="Heading3"/>
+        <w:keepNext/>
+      </w:pPr>
+      <w:r>
+        <w:t>Plan and examine additional work</w:t>
+      </w:r>
+    </w:p>
+    <w:p>
+      <w:r>
+        <w:t>When new work is justified, link the research question to a proposed method, any specimen or dataset, controls, handling history, measurement and quality information. Evaluate positive, negative, unexpected and inconclusive results in light of those details rather than treating a test label as a complete answer.</w:t>
+      </w:r>
+    </w:p>
+    <w:p>
+      <w:pPr>
+        <w:pStyle w:val="Heading3"/>
+        <w:keepNext/>
+      </w:pPr>
+      <w:r>
+        <w:t>Report and continue</w:t>
+      </w:r>
+    </w:p>
+    <w:p>
+      <w:r>
+        <w:t>A case account should distinguish the participant’s experience, observed evidence, laboratory findings, interpretation and unanswered questions. It should show what was learned, what remains uncertain and what next investigation would be meaningful.</w:t>
+      </w:r>
+    </w:p>
+    <w:p>
+      <w:pPr>
+        <w:pStyle w:val="Heading2"/>
+        <w:keepNext/>
+      </w:pPr>
+      <w:r>
+        <w:t>People and health information</w:t>
+      </w:r>
+    </w:p>
+    <w:p>
+      <w:r>
+        <w:t>A later participant-facing system would need to separate identity and contact details from research analysis where appropriate, restrict access by purpose, record consent or other lawful authority, and allow the participant to understand how information and samples are used. Study-specific ethical review and privacy governance must be settled before Warrigal is used to collect real participant health information.</w:t>
+      </w:r>
+    </w:p>
+    <w:p>
+      <w:r>
+        <w:t>The practical design includes controlled access, traceable changes, secure storage, retention and withdrawal rules, and an account of what can be shared with researchers, laboratories or clinicians. These are part of making research trustworthy, not a substitute for the scientific work.</w:t>
+      </w:r>
+    </w:p>
+    <w:p>
+      <w:pPr>
+        <w:pStyle w:val="Heading2"/>
+        <w:keepNext/>
+      </w:pPr>
+      <w:r>
+        <w:t>Future reference laboratory</w:t>
+      </w:r>
+    </w:p>
+    <w:p>
+      <w:r>
+        <w:t>The reference laboratory is a long-term capability connected to the human health research pathway. A specialist reference laboratory is a useful point of reference for expertise and reproducible methods, but Warrigal’s eventual remit should be defined by its own research questions and collaborators rather than copied from another organisation.</w:t>
+      </w:r>
+    </w:p>
+    <w:p>
+      <w:r>
+        <w:t>A future laboratory or laboratory partnership could investigate a defined biological question arising from a case or research programme; examine specimens using appropriate documented methods; evaluate testing approaches; and retain sample identity, handling history, controls, quality records, raw findings and interpretation. Warrigal would connect each result to the consent, research question, sample, method and review behind it.</w:t>
+      </w:r>
+    </w:p>
+    <w:p>
+      <w:r>
+        <w:t>There is a staged path: first build a sound research and case-study workspace; then work with qualified researchers, clinicians and established laboratories on defined questions; and only later consider whether an independent reference laboratory is justified. A research laboratory, a specialist testing partnership and a clinical pathology service are distinct undertakings. Any patient-care or diagnostic role would need to be defined and governed separately.</w:t>
+      </w:r>
+    </w:p>
+    <w:p>
+      <w:pPr>
+        <w:pStyle w:val="Heading2"/>
+        <w:keepNext/>
+      </w:pPr>
+      <w:r>
+        <w:t>Creation path for the health area</w:t>
+      </w:r>
+    </w:p>
+    <w:p>
+      <w:r>
+        <w:t>Begin with a human health research project using published material and non-identifiable example data. Demonstrate a question moving among biological levels, competing explanations, methods and a source-grounded report.</w:t>
+      </w:r>
+    </w:p>
+    <w:p>
+      <w:r>
+        <w:t>Next, define the case-study and laboratory research records: what a case contains, how authority and access are recorded, how specimens and assays would be linked, and how uncertainty and quality problems appear in a result. Test the design before handling real participant information.</w:t>
+      </w:r>
+    </w:p>
+    <w:p>
+      <w:r>
+        <w:t>Use collaborations and specific studies to learn which laboratory and participant workflows are genuinely needed. The possibility of a reference laboratory remains visible in the suite’s direction without claiming that a facility, accredited testing service or clinical pathway already exists.</w:t>
+      </w:r>
+    </w:p>
+    <w:p>
+      <w:pPr>
+        <w:pStyle w:val="Heading1"/>
+        <w:keepNext/>
+      </w:pPr>
+      <w:r>
+        <w:t>6 Mathematical, sequence, audio and visual tools</w:t>
       </w:r>
     </w:p>
     <w:p>
@@ -339,7 +640,7 @@
         <w:keepNext/>
       </w:pPr>
       <w:r>
-        <w:t>6 Evidence exploration and research intelligence</w:t>
+        <w:t>7 Evidence exploration and research intelligence</w:t>
       </w:r>
     </w:p>
     <w:p>
@@ -358,7 +659,7 @@
         <w:keepNext/>
       </w:pPr>
       <w:r>
-        <w:t>7 Publishing and communication</w:t>
+        <w:t>8 Publishing and communication</w:t>
       </w:r>
     </w:p>
     <w:p>
@@ -377,7 +678,7 @@
         <w:keepNext/>
       </w:pPr>
       <w:r>
-        <w:t>8 Project work and collaboration</w:t>
+        <w:t>9 Project work and collaboration</w:t>
       </w:r>
     </w:p>
     <w:p>
@@ -401,7 +702,7 @@
         <w:keepNext/>
       </w:pPr>
       <w:r>
-        <w:t>9 Relationship to JUFE and other systems</w:t>
+        <w:t>10 Relationship to JUFE and other systems</w:t>
       </w:r>
     </w:p>
     <w:p>
@@ -420,7 +721,7 @@
         <w:keepNext/>
       </w:pPr>
       <w:r>
-        <w:t>10 What exists and what remains to be created</w:t>
+        <w:t>11 What exists and what remains to be created</w:t>
       </w:r>
     </w:p>
     <w:p>
@@ -444,7 +745,7 @@
         <w:pStyle w:val="ListBullet"/>
       </w:pPr>
       <w:r>
-        <w:t>Mycology, biology, chemistry and workshop experience: long-standing suite direction and earlier application areas; complete integrated workflows are not established by the current acquisition code.</w:t>
+        <w:t>Mycology, plant, human health, biology, chemistry and workshop experience: long-standing suite direction and earlier application areas; complete integrated workflows are not established by the current acquisition code.</w:t>
       </w:r>
     </w:p>
     <w:p>
@@ -482,7 +783,7 @@
         <w:keepNext/>
       </w:pPr>
       <w:r>
-        <w:t>11 Creation path</w:t>
+        <w:t>12 Creation path</w:t>
       </w:r>
     </w:p>
     <w:p>
@@ -510,7 +811,7 @@
     </w:p>
     <w:p>
       <w:r>
-        <w:t>Use a real mycology investigation to define the Mushroom Lab: an observation or specimen, evidence for identification or mechanism, a cultivation or practical experiment when relevant, dated results and an explicit conclusion or next question. Develop biology, chemistry and workshop records from similarly concrete work rather than guessing every field in advance.</w:t>
+        <w:t>Use a real mycology investigation to define the Mushroom Lab: an observation or specimen, evidence for identification or mechanism, a cultivation or practical experiment when relevant, dated results and an explicit conclusion or next question. Develop biology, chemistry and workshop records from similarly concrete work rather than guessing every field in advance. Apply the same project discipline to a plant investigation and to a human health research question using published or non-identifiable material before any participant-facing study.</w:t>
       </w:r>
     </w:p>
     <w:p>
@@ -558,7 +859,7 @@
     <w:sectPr>
       <w:footerReference w:type="default" r:id="rId9"/>
       <w:pgSz w:w="12240" w:h="15840"/>
-      <w:pgMar w:top="1123" w:right="1296" w:bottom="1080" w:left="1296" w:header="720" w:footer="720" w:gutter="0"/>
+      <w:pgMar w:top="1037" w:right="1296" w:bottom="979" w:left="1296" w:header="720" w:footer="720" w:gutter="0"/>
       <w:cols w:space="720"/>
       <w:docGrid w:linePitch="360"/>
     </w:sectPr>
@@ -949,7 +1250,7 @@
     <w:qFormat/>
     <w:rsid w:val="00FC693F"/>
     <w:pPr>
-      <w:spacing w:before="0" w:after="120" w:line="271" w:lineRule="auto"/>
+      <w:spacing w:before="0" w:after="100" w:line="266" w:lineRule="auto"/>
     </w:pPr>
     <w:rPr>
       <w:rFonts w:ascii="Aptos" w:hAnsi="Aptos"/>
@@ -1065,10 +1366,10 @@
       <w:outlineLvl w:val="2"/>
     </w:pPr>
     <w:rPr>
-      <w:rFonts w:asciiTheme="majorHAnsi" w:eastAsiaTheme="majorEastAsia" w:hAnsiTheme="majorHAnsi" w:cstheme="majorBidi"/>
+      <w:rFonts w:asciiTheme="majorHAnsi" w:eastAsiaTheme="majorEastAsia" w:hAnsiTheme="majorHAnsi" w:cstheme="majorBidi" w:ascii="Aptos" w:hAnsi="Aptos"/>
       <w:b/>
       <w:bCs/>
-      <w:color w:val="4F81BD" w:themeColor="accent1"/>
+      <w:color w:val="000000"/>
     </w:rPr>
   </w:style>
   <w:style w:type="paragraph" w:styleId="Heading4">

</xml_diff>

<commit_message>
Add project vision document
Add the current Warrigal Research Suite project vision as a tracked
docs file.

Co-Authored-By: Claude Sonnet 5 <noreply@anthropic.com>
</commit_message>
<xml_diff>
--- a/docs/Warrigal_Research_Suite_Project_Vision.docx
+++ b/docs/Warrigal_Research_Suite_Project_Vision.docx
@@ -255,62 +255,6 @@
         <w:keepNext/>
       </w:pPr>
       <w:r>
-        <w:t>Plant research</w:t>
-      </w:r>
-    </w:p>
-    <w:p>
-      <w:r>
-        <w:t>Plant research should have its own place alongside the Mushroom Lab. The suite should support botany, native plant and ecological research, cultivation, plant chemistry, and questions about relationships among plants, fungi, microbes, environments and human use. It should not treat a plant as a mushroom record with a different label.</w:t>
-      </w:r>
-    </w:p>
-    <w:p>
-      <w:r>
-        <w:t>A plant investigation might begin with a field observation, a specimen or image, a cultivation trial, a chemical constituent, a biological interaction or a question from the literature. It should be possible to follow that inquiry from identification and context through methods, repeated observations, evidence comparisons and practical outcomes.</w:t>
-      </w:r>
-    </w:p>
-    <w:p>
-      <w:pPr>
-        <w:pStyle w:val="ListBullet"/>
-      </w:pPr>
-      <w:r>
-        <w:t>Field and identification records: location and habitat when appropriate, date, images, morphological features, candidate identifications, comparisons, confidence and later revisions.</w:t>
-      </w:r>
-    </w:p>
-    <w:p>
-      <w:pPr>
-        <w:pStyle w:val="ListBullet"/>
-      </w:pPr>
-      <w:r>
-        <w:t>Growth and ecology: conditions, developmental stage, seasonal changes, associations with other organisms, interventions, measurements and repeated observations.</w:t>
-      </w:r>
-    </w:p>
-    <w:p>
-      <w:pPr>
-        <w:pStyle w:val="ListBullet"/>
-      </w:pPr>
-      <w:r>
-        <w:t>Chemistry and human relevance: source-linked research on constituents, preparation or extraction methods, biological activity and uncertainty, without treating a traditional use or preliminary study as clinical proof.</w:t>
-      </w:r>
-    </w:p>
-    <w:p>
-      <w:pPr>
-        <w:pStyle w:val="ListBullet"/>
-      </w:pPr>
-      <w:r>
-        <w:t>Practical work: cultivation, propagation, materials or ecological experiments linked to the relevant project, method and results.</w:t>
-      </w:r>
-    </w:p>
-    <w:p>
-      <w:r>
-        <w:t>Mycology and plant research should be able to connect when an investigation calls for it, such as ecological interactions or shared field work. Each still needs records suited to its organism, methods and questions.</w:t>
-      </w:r>
-    </w:p>
-    <w:p>
-      <w:pPr>
-        <w:pStyle w:val="Heading2"/>
-        <w:keepNext/>
-      </w:pPr>
-      <w:r>
         <w:t>Biology and chemistry</w:t>
       </w:r>
     </w:p>
@@ -339,252 +283,7 @@
         <w:keepNext/>
       </w:pPr>
       <w:r>
-        <w:t>5 Human health research and future reference laboratory</w:t>
-      </w:r>
-    </w:p>
-    <w:p>
-      <w:r>
-        <w:t>Human health is a major research direction for Warrigal Research Suite. It draws on biology and human biomolecular science to investigate disease across the person, anatomy, embryonic and tissue development, cells, genes, proteins, microorganisms, viruses and the methods used to study them. The purpose is to move between those levels in a single investigation while keeping the evidence for each connection visible.</w:t>
-      </w:r>
-    </w:p>
-    <w:p>
-      <w:r>
-        <w:t>A project may begin with an unresolved health question, an observed feature, a tissue finding, an organism, a viral mechanism, a genetic question or an unusual laboratory result. Warrigal should help define the question, examine existing research, distinguish observations from interpretations, compare possible mechanisms and identify what evidence could clarify the uncertainty.</w:t>
-      </w:r>
-    </w:p>
-    <w:p>
-      <w:pPr>
-        <w:pStyle w:val="Heading2"/>
-        <w:keepNext/>
-      </w:pPr>
-      <w:r>
-        <w:t>Human health research projects</w:t>
-      </w:r>
-    </w:p>
-    <w:p>
-      <w:r>
-        <w:t>A health research project is the working record for a question and its development. It is broader than a patient file and more structured than a folder of papers. It should be able to connect the following parts without forcing them into one kind of evidence:</w:t>
-      </w:r>
-    </w:p>
-    <w:p>
-      <w:pPr>
-        <w:pStyle w:val="ListBullet"/>
-      </w:pPr>
-      <w:r>
-        <w:t>The question and its history: what prompted the investigation, how the question changed, and what remains unresolved.</w:t>
-      </w:r>
-    </w:p>
-    <w:p>
-      <w:pPr>
-        <w:pStyle w:val="ListBullet"/>
-      </w:pPr>
-      <w:r>
-        <w:t>Biological context: relevant anatomy, tissue changes, development, physiology, cellular pathways, genetics, microbiology and virology.</w:t>
-      </w:r>
-    </w:p>
-    <w:p>
-      <w:pPr>
-        <w:pStyle w:val="ListBullet"/>
-      </w:pPr>
-      <w:r>
-        <w:t>Published research: findings, methods, study populations, controls, limitations and the exact source behind each claim.</w:t>
-      </w:r>
-    </w:p>
-    <w:p>
-      <w:pPr>
-        <w:pStyle w:val="ListBullet"/>
-      </w:pPr>
-      <w:r>
-        <w:t>Observations and data: dated observations, measurements and existing records, with their origins and gaps made clear.</w:t>
-      </w:r>
-    </w:p>
-    <w:p>
-      <w:pPr>
-        <w:pStyle w:val="ListBullet"/>
-      </w:pPr>
-      <w:r>
-        <w:t>Possible explanations: what each accounts for, what supports or challenges it, and what result might distinguish alternatives.</w:t>
-      </w:r>
-    </w:p>
-    <w:p>
-      <w:pPr>
-        <w:pStyle w:val="ListBullet"/>
-      </w:pPr>
-      <w:r>
-        <w:t>Methods and results: analyses or laboratory work, including samples where appropriate, controls, quality concerns, findings and interpretation.</w:t>
-      </w:r>
-    </w:p>
-    <w:p>
-      <w:pPr>
-        <w:pStyle w:val="ListBullet"/>
-      </w:pPr>
-      <w:r>
-        <w:t>Next steps and outputs: research questions, collaborator review, case studies and reports grounded in the recorded work.</w:t>
-      </w:r>
-    </w:p>
-    <w:p>
-      <w:r>
-        <w:t>This structure can support microbiology, viruses and viral pathogenesis, disease mechanisms, anatomy, tissue development, molecular biology, genetics and gene-editing research. Those areas need usable scientific relationships, not merely tags attached to documents.</w:t>
-      </w:r>
-    </w:p>
-    <w:p>
-      <w:pPr>
-        <w:pStyle w:val="Heading2"/>
-        <w:keepNext/>
-      </w:pPr>
-      <w:r>
-        <w:t>Voluntary case investigations</w:t>
-      </w:r>
-    </w:p>
-    <w:p>
-      <w:r>
-        <w:t>A person with an unresolved health question could choose to participate in a structured research investigation. The aim is to gather and examine evidence carefully, including laboratory evidence where appropriate, and state what can and cannot be concluded. Participation should be voluntary and based on a defined research purpose. The research process does not promise a diagnosis or replace a person’s existing care.</w:t>
-      </w:r>
-    </w:p>
-    <w:p>
-      <w:pPr>
-        <w:pStyle w:val="Heading3"/>
-        <w:keepNext/>
-      </w:pPr>
-      <w:r>
-        <w:t>Define the question and participation</w:t>
-      </w:r>
-    </w:p>
-    <w:p>
-      <w:r>
-        <w:t>Record what the participant wants investigated, what the research proposes to do, what information or specimens may be involved, how results may be handled and the limits of the investigation. Consent and access decisions should be recorded as part of the study, not detached from its data.</w:t>
-      </w:r>
-    </w:p>
-    <w:p>
-      <w:pPr>
-        <w:pStyle w:val="Heading3"/>
-        <w:keepNext/>
-      </w:pPr>
-      <w:r>
-        <w:t>Assemble existing evidence</w:t>
-      </w:r>
-    </w:p>
-    <w:p>
-      <w:r>
-        <w:t>Organise the participant’s account, existing records, earlier tests, dated observations and relevant literature. Preserve contradictory and inconclusive findings. A result should retain the method, timing and context in which it was obtained.</w:t>
-      </w:r>
-    </w:p>
-    <w:p>
-      <w:pPr>
-        <w:pStyle w:val="Heading3"/>
-        <w:keepNext/>
-      </w:pPr>
-      <w:r>
-        <w:t>Develop testable possibilities</w:t>
-      </w:r>
-    </w:p>
-    <w:p>
-      <w:r>
-        <w:t>Connect possible biological explanations to observations they might account for. Record assumptions and alternative explanations. Specify what further observation, analysis or specialist review could support or weaken each possibility.</w:t>
-      </w:r>
-    </w:p>
-    <w:p>
-      <w:pPr>
-        <w:pStyle w:val="Heading3"/>
-        <w:keepNext/>
-      </w:pPr>
-      <w:r>
-        <w:t>Plan and examine additional work</w:t>
-      </w:r>
-    </w:p>
-    <w:p>
-      <w:r>
-        <w:t>When new work is justified, link the research question to a proposed method, any specimen or dataset, controls, handling history, measurement and quality information. Evaluate positive, negative, unexpected and inconclusive results in light of those details rather than treating a test label as a complete answer.</w:t>
-      </w:r>
-    </w:p>
-    <w:p>
-      <w:pPr>
-        <w:pStyle w:val="Heading3"/>
-        <w:keepNext/>
-      </w:pPr>
-      <w:r>
-        <w:t>Report and continue</w:t>
-      </w:r>
-    </w:p>
-    <w:p>
-      <w:r>
-        <w:t>A case account should distinguish the participant’s experience, observed evidence, laboratory findings, interpretation and unanswered questions. It should show what was learned, what remains uncertain and what next investigation would be meaningful.</w:t>
-      </w:r>
-    </w:p>
-    <w:p>
-      <w:pPr>
-        <w:pStyle w:val="Heading2"/>
-        <w:keepNext/>
-      </w:pPr>
-      <w:r>
-        <w:t>People and health information</w:t>
-      </w:r>
-    </w:p>
-    <w:p>
-      <w:r>
-        <w:t>A later participant-facing system would need to separate identity and contact details from research analysis where appropriate, restrict access by purpose, record consent or other lawful authority, and allow the participant to understand how information and samples are used. Study-specific ethical review and privacy governance must be settled before Warrigal is used to collect real participant health information.</w:t>
-      </w:r>
-    </w:p>
-    <w:p>
-      <w:r>
-        <w:t>The practical design includes controlled access, traceable changes, secure storage, retention and withdrawal rules, and an account of what can be shared with researchers, laboratories or clinicians. These are part of making research trustworthy, not a substitute for the scientific work.</w:t>
-      </w:r>
-    </w:p>
-    <w:p>
-      <w:pPr>
-        <w:pStyle w:val="Heading2"/>
-        <w:keepNext/>
-      </w:pPr>
-      <w:r>
-        <w:t>Future reference laboratory</w:t>
-      </w:r>
-    </w:p>
-    <w:p>
-      <w:r>
-        <w:t>The reference laboratory is a long-term capability connected to the human health research pathway. A specialist reference laboratory is a useful point of reference for expertise and reproducible methods, but Warrigal’s eventual remit should be defined by its own research questions and collaborators rather than copied from another organisation.</w:t>
-      </w:r>
-    </w:p>
-    <w:p>
-      <w:r>
-        <w:t>A future laboratory or laboratory partnership could investigate a defined biological question arising from a case or research programme; examine specimens using appropriate documented methods; evaluate testing approaches; and retain sample identity, handling history, controls, quality records, raw findings and interpretation. Warrigal would connect each result to the consent, research question, sample, method and review behind it.</w:t>
-      </w:r>
-    </w:p>
-    <w:p>
-      <w:r>
-        <w:t>There is a staged path: first build a sound research and case-study workspace; then work with qualified researchers, clinicians and established laboratories on defined questions; and only later consider whether an independent reference laboratory is justified. A research laboratory, a specialist testing partnership and a clinical pathology service are distinct undertakings. Any patient-care or diagnostic role would need to be defined and governed separately.</w:t>
-      </w:r>
-    </w:p>
-    <w:p>
-      <w:pPr>
-        <w:pStyle w:val="Heading2"/>
-        <w:keepNext/>
-      </w:pPr>
-      <w:r>
-        <w:t>Creation path for the health area</w:t>
-      </w:r>
-    </w:p>
-    <w:p>
-      <w:r>
-        <w:t>Begin with a human health research project using published material and non-identifiable example data. Demonstrate a question moving among biological levels, competing explanations, methods and a source-grounded report.</w:t>
-      </w:r>
-    </w:p>
-    <w:p>
-      <w:r>
-        <w:t>Next, define the case-study and laboratory research records: what a case contains, how authority and access are recorded, how specimens and assays would be linked, and how uncertainty and quality problems appear in a result. Test the design before handling real participant information.</w:t>
-      </w:r>
-    </w:p>
-    <w:p>
-      <w:r>
-        <w:t>Use collaborations and specific studies to learn which laboratory and participant workflows are genuinely needed. The possibility of a reference laboratory remains visible in the suite’s direction without claiming that a facility, accredited testing service or clinical pathway already exists.</w:t>
-      </w:r>
-    </w:p>
-    <w:p>
-      <w:pPr>
-        <w:pStyle w:val="Heading1"/>
-        <w:keepNext/>
-      </w:pPr>
-      <w:r>
-        <w:t>6 Mathematical, sequence, audio and visual tools</w:t>
+        <w:t>5 Mathematical, sequence, audio and visual tools</w:t>
       </w:r>
     </w:p>
     <w:p>
@@ -640,7 +339,7 @@
         <w:keepNext/>
       </w:pPr>
       <w:r>
-        <w:t>7 Evidence exploration and research intelligence</w:t>
+        <w:t>6 Evidence exploration and research intelligence</w:t>
       </w:r>
     </w:p>
     <w:p>
@@ -659,7 +358,7 @@
         <w:keepNext/>
       </w:pPr>
       <w:r>
-        <w:t>8 Publishing and communication</w:t>
+        <w:t>7 Publishing and communication</w:t>
       </w:r>
     </w:p>
     <w:p>
@@ -678,7 +377,7 @@
         <w:keepNext/>
       </w:pPr>
       <w:r>
-        <w:t>9 Project work and collaboration</w:t>
+        <w:t>8 Project work and collaboration</w:t>
       </w:r>
     </w:p>
     <w:p>
@@ -702,7 +401,7 @@
         <w:keepNext/>
       </w:pPr>
       <w:r>
-        <w:t>10 Relationship to JUFE and other systems</w:t>
+        <w:t>9 Relationship to JUFE and other systems</w:t>
       </w:r>
     </w:p>
     <w:p>
@@ -721,7 +420,7 @@
         <w:keepNext/>
       </w:pPr>
       <w:r>
-        <w:t>11 What exists and what remains to be created</w:t>
+        <w:t>10 What exists and what remains to be created</w:t>
       </w:r>
     </w:p>
     <w:p>
@@ -745,7 +444,7 @@
         <w:pStyle w:val="ListBullet"/>
       </w:pPr>
       <w:r>
-        <w:t>Mycology, plant, human health, biology, chemistry and workshop experience: long-standing suite direction and earlier application areas; complete integrated workflows are not established by the current acquisition code.</w:t>
+        <w:t>Mycology, biology, chemistry and workshop experience: long-standing suite direction and earlier application areas; complete integrated workflows are not established by the current acquisition code.</w:t>
       </w:r>
     </w:p>
     <w:p>
@@ -783,7 +482,7 @@
         <w:keepNext/>
       </w:pPr>
       <w:r>
-        <w:t>12 Creation path</w:t>
+        <w:t>11 Creation path</w:t>
       </w:r>
     </w:p>
     <w:p>
@@ -811,7 +510,7 @@
     </w:p>
     <w:p>
       <w:r>
-        <w:t>Use a real mycology investigation to define the Mushroom Lab: an observation or specimen, evidence for identification or mechanism, a cultivation or practical experiment when relevant, dated results and an explicit conclusion or next question. Develop biology, chemistry and workshop records from similarly concrete work rather than guessing every field in advance. Apply the same project discipline to a plant investigation and to a human health research question using published or non-identifiable material before any participant-facing study.</w:t>
+        <w:t>Use a real mycology investigation to define the Mushroom Lab: an observation or specimen, evidence for identification or mechanism, a cultivation or practical experiment when relevant, dated results and an explicit conclusion or next question. Develop biology, chemistry and workshop records from similarly concrete work rather than guessing every field in advance.</w:t>
       </w:r>
     </w:p>
     <w:p>
@@ -826,6 +525,47 @@
     <w:p>
       <w:r>
         <w:t>Make the Name Calculator, Vortex Sets, Audio Generator and Sequence Laboratory accessible with clear inputs, rules and saved results. Connect a tool to a research project when its output has a defined research purpose. Preserve freedom to revise the tools as their methods develop.</w:t>
+      </w:r>
+    </w:p>
+    <w:p>
+      <w:pPr>
+        <w:pStyle w:val="Heading2"/>
+        <w:keepNext/>
+      </w:pPr>
+      <w:r>
+        <w:t>Therapeutics Data Commons and method benchmarking</w:t>
+      </w:r>
+    </w:p>
+    <w:p>
+      <w:pPr>
+        <w:keepNext/>
+      </w:pPr>
+      <w:r>
+        <w:t>Therapeutics Data Commons (TDC / PyTDC) should be evaluated as a future specialist integration for Warrigal’s biomedical, biological, chemical and therapeutic research workflows. Its principal value to Warrigal is not simply access to additional data, but access to established datasets, tasks, data splits, evaluation methods and benchmarks against which new analytical methods can be tested.</w:t>
+      </w:r>
+    </w:p>
+    <w:p>
+      <w:pPr>
+        <w:keepNext/>
+      </w:pPr>
+      <w:r>
+        <w:t>A Warrigal method could be applied to a defined TDC task and compared with conventional or published approaches using common data and evaluation criteria. This could support testing of future molecular, biological, machine-learning, sequence or other experimental analytical methods developed within or connected to Warrigal. A different or improved result would remain a benchmark result for that particular task rather than being treated automatically as broader scientific validation.</w:t>
+      </w:r>
+    </w:p>
+    <w:p>
+      <w:pPr>
+        <w:keepNext/>
+      </w:pPr>
+      <w:r>
+        <w:t>TDC should be connected through a defined external adapter rather than becoming part of Warrigal’s canonical evidence core. Each experiment should retain the TDC dataset and version, task, data split, evaluation metric, method configuration, software version, source and resulting outputs so that the comparison can be inspected and reproduced. The licence and usage conditions of each underlying dataset must also be retained independently of the licence applying to the TDC software.</w:t>
+      </w:r>
+    </w:p>
+    <w:p>
+      <w:pPr>
+        <w:keepNext/>
+      </w:pPr>
+      <w:r>
+        <w:t>Status: Proposed — not implemented.</w:t>
       </w:r>
     </w:p>
     <w:p>
@@ -859,7 +599,7 @@
     <w:sectPr>
       <w:footerReference w:type="default" r:id="rId9"/>
       <w:pgSz w:w="12240" w:h="15840"/>
-      <w:pgMar w:top="1037" w:right="1296" w:bottom="979" w:left="1296" w:header="720" w:footer="720" w:gutter="0"/>
+      <w:pgMar w:top="1123" w:right="1296" w:bottom="1080" w:left="1296" w:header="720" w:footer="720" w:gutter="0"/>
       <w:cols w:space="720"/>
       <w:docGrid w:linePitch="360"/>
     </w:sectPr>
@@ -1250,7 +990,7 @@
     <w:qFormat/>
     <w:rsid w:val="00FC693F"/>
     <w:pPr>
-      <w:spacing w:before="0" w:after="100" w:line="266" w:lineRule="auto"/>
+      <w:spacing w:before="0" w:after="120" w:line="271" w:lineRule="auto"/>
     </w:pPr>
     <w:rPr>
       <w:rFonts w:ascii="Aptos" w:hAnsi="Aptos"/>
@@ -1366,10 +1106,10 @@
       <w:outlineLvl w:val="2"/>
     </w:pPr>
     <w:rPr>
-      <w:rFonts w:asciiTheme="majorHAnsi" w:eastAsiaTheme="majorEastAsia" w:hAnsiTheme="majorHAnsi" w:cstheme="majorBidi" w:ascii="Aptos" w:hAnsi="Aptos"/>
+      <w:rFonts w:asciiTheme="majorHAnsi" w:eastAsiaTheme="majorEastAsia" w:hAnsiTheme="majorHAnsi" w:cstheme="majorBidi"/>
       <w:b/>
       <w:bCs/>
-      <w:color w:val="000000"/>
+      <w:color w:val="4F81BD" w:themeColor="accent1"/>
     </w:rPr>
   </w:style>
   <w:style w:type="paragraph" w:styleId="Heading4">

</xml_diff>

<commit_message>
Clean up project documentation and restore vision sections
Co-Authored-By: Claude Sonnet 5 <noreply@anthropic.com>
</commit_message>
<xml_diff>
--- a/docs/Warrigal_Research_Suite_Project_Vision.docx
+++ b/docs/Warrigal_Research_Suite_Project_Vision.docx
@@ -255,6 +255,62 @@
         <w:keepNext/>
       </w:pPr>
       <w:r>
+        <w:t>Plant research</w:t>
+      </w:r>
+    </w:p>
+    <w:p>
+      <w:r>
+        <w:t>Plant research should have its own place alongside the Mushroom Lab. The suite should support botany, native plant and ecological research, cultivation, plant chemistry, and questions about relationships among plants, fungi, microbes, environments and human use. It should not treat a plant as a mushroom record with a different label.</w:t>
+      </w:r>
+    </w:p>
+    <w:p>
+      <w:r>
+        <w:t>A plant investigation might begin with a field observation, a specimen or image, a cultivation trial, a chemical constituent, a biological interaction or a question from the literature. It should be possible to follow that inquiry from identification and context through methods, repeated observations, evidence comparisons and practical outcomes.</w:t>
+      </w:r>
+    </w:p>
+    <w:p>
+      <w:pPr>
+        <w:pStyle w:val="ListBullet"/>
+      </w:pPr>
+      <w:r>
+        <w:t>Field and identification records: location and habitat when appropriate, date, images, morphological features, candidate identifications, comparisons, confidence and later revisions.</w:t>
+      </w:r>
+    </w:p>
+    <w:p>
+      <w:pPr>
+        <w:pStyle w:val="ListBullet"/>
+      </w:pPr>
+      <w:r>
+        <w:t>Growth and ecology: conditions, developmental stage, seasonal changes, associations with other organisms, interventions, measurements and repeated observations.</w:t>
+      </w:r>
+    </w:p>
+    <w:p>
+      <w:pPr>
+        <w:pStyle w:val="ListBullet"/>
+      </w:pPr>
+      <w:r>
+        <w:t>Chemistry and human relevance: source-linked research on constituents, preparation or extraction methods, biological activity and uncertainty, without treating a traditional use or preliminary study as clinical proof.</w:t>
+      </w:r>
+    </w:p>
+    <w:p>
+      <w:pPr>
+        <w:pStyle w:val="ListBullet"/>
+      </w:pPr>
+      <w:r>
+        <w:t>Practical work: cultivation, propagation, materials or ecological experiments linked to the relevant project, method and results.</w:t>
+      </w:r>
+    </w:p>
+    <w:p>
+      <w:r>
+        <w:t>Mycology and plant research should be able to connect when an investigation calls for it, such as ecological interactions or shared field work. Each still needs records suited to its organism, methods and questions.</w:t>
+      </w:r>
+    </w:p>
+    <w:p>
+      <w:pPr>
+        <w:pStyle w:val="Heading2"/>
+        <w:keepNext/>
+      </w:pPr>
+      <w:r>
         <w:t>Biology and chemistry</w:t>
       </w:r>
     </w:p>
@@ -283,7 +339,252 @@
         <w:keepNext/>
       </w:pPr>
       <w:r>
-        <w:t>5 Mathematical, sequence, audio and visual tools</w:t>
+        <w:t>5 Human health research and future reference laboratory</w:t>
+      </w:r>
+    </w:p>
+    <w:p>
+      <w:r>
+        <w:t>Human health is a major research direction for Warrigal Research Suite. It draws on biology and human biomolecular science to investigate disease across the person, anatomy, embryonic and tissue development, cells, genes, proteins, microorganisms, viruses and the methods used to study them. The purpose is to move between those levels in a single investigation while keeping the evidence for each connection visible.</w:t>
+      </w:r>
+    </w:p>
+    <w:p>
+      <w:r>
+        <w:t>A project may begin with an unresolved health question, an observed feature, a tissue finding, an organism, a viral mechanism, a genetic question or an unusual laboratory result. Warrigal should help define the question, examine existing research, distinguish observations from interpretations, compare possible mechanisms and identify what evidence could clarify the uncertainty.</w:t>
+      </w:r>
+    </w:p>
+    <w:p>
+      <w:pPr>
+        <w:pStyle w:val="Heading2"/>
+        <w:keepNext/>
+      </w:pPr>
+      <w:r>
+        <w:t>Human health research projects</w:t>
+      </w:r>
+    </w:p>
+    <w:p>
+      <w:r>
+        <w:t>A health research project is the working record for a question and its development. It is broader than a patient file and more structured than a folder of papers. It should be able to connect the following parts without forcing them into one kind of evidence:</w:t>
+      </w:r>
+    </w:p>
+    <w:p>
+      <w:pPr>
+        <w:pStyle w:val="ListBullet"/>
+      </w:pPr>
+      <w:r>
+        <w:t>The question and its history: what prompted the investigation, how the question changed, and what remains unresolved.</w:t>
+      </w:r>
+    </w:p>
+    <w:p>
+      <w:pPr>
+        <w:pStyle w:val="ListBullet"/>
+      </w:pPr>
+      <w:r>
+        <w:t>Biological context: relevant anatomy, tissue changes, development, physiology, cellular pathways, genetics, microbiology and virology.</w:t>
+      </w:r>
+    </w:p>
+    <w:p>
+      <w:pPr>
+        <w:pStyle w:val="ListBullet"/>
+      </w:pPr>
+      <w:r>
+        <w:t>Published research: findings, methods, study populations, controls, limitations and the exact source behind each claim.</w:t>
+      </w:r>
+    </w:p>
+    <w:p>
+      <w:pPr>
+        <w:pStyle w:val="ListBullet"/>
+      </w:pPr>
+      <w:r>
+        <w:t>Observations and data: dated observations, measurements and existing records, with their origins and gaps made clear.</w:t>
+      </w:r>
+    </w:p>
+    <w:p>
+      <w:pPr>
+        <w:pStyle w:val="ListBullet"/>
+      </w:pPr>
+      <w:r>
+        <w:t>Possible explanations: what each accounts for, what supports or challenges it, and what result might distinguish alternatives.</w:t>
+      </w:r>
+    </w:p>
+    <w:p>
+      <w:pPr>
+        <w:pStyle w:val="ListBullet"/>
+      </w:pPr>
+      <w:r>
+        <w:t>Methods and results: analyses or laboratory work, including samples where appropriate, controls, quality concerns, findings and interpretation.</w:t>
+      </w:r>
+    </w:p>
+    <w:p>
+      <w:pPr>
+        <w:pStyle w:val="ListBullet"/>
+      </w:pPr>
+      <w:r>
+        <w:t>Next steps and outputs: research questions, collaborator review, case studies and reports grounded in the recorded work.</w:t>
+      </w:r>
+    </w:p>
+    <w:p>
+      <w:r>
+        <w:t>This structure can support microbiology, viruses and viral pathogenesis, disease mechanisms, anatomy, tissue development, molecular biology, genetics and gene-editing research. Those areas need usable scientific relationships, not merely tags attached to documents.</w:t>
+      </w:r>
+    </w:p>
+    <w:p>
+      <w:pPr>
+        <w:pStyle w:val="Heading2"/>
+        <w:keepNext/>
+      </w:pPr>
+      <w:r>
+        <w:t>Voluntary case investigations</w:t>
+      </w:r>
+    </w:p>
+    <w:p>
+      <w:r>
+        <w:t>A person with an unresolved health question could choose to participate in a structured research investigation. The aim is to gather and examine evidence carefully, including laboratory evidence where appropriate, and state what can and cannot be concluded. Participation should be voluntary and based on a defined research purpose. The research process does not promise a diagnosis or replace a person’s existing care.</w:t>
+      </w:r>
+    </w:p>
+    <w:p>
+      <w:pPr>
+        <w:pStyle w:val="Heading3"/>
+        <w:keepNext/>
+      </w:pPr>
+      <w:r>
+        <w:t>Define the question and participation</w:t>
+      </w:r>
+    </w:p>
+    <w:p>
+      <w:r>
+        <w:t>Record what the participant wants investigated, what the research proposes to do, what information or specimens may be involved, how results may be handled and the limits of the investigation. Consent and access decisions should be recorded as part of the study, not detached from its data.</w:t>
+      </w:r>
+    </w:p>
+    <w:p>
+      <w:pPr>
+        <w:pStyle w:val="Heading3"/>
+        <w:keepNext/>
+      </w:pPr>
+      <w:r>
+        <w:t>Assemble existing evidence</w:t>
+      </w:r>
+    </w:p>
+    <w:p>
+      <w:r>
+        <w:t>Organise the participant’s account, existing records, earlier tests, dated observations and relevant literature. Preserve contradictory and inconclusive findings. A result should retain the method, timing and context in which it was obtained.</w:t>
+      </w:r>
+    </w:p>
+    <w:p>
+      <w:pPr>
+        <w:pStyle w:val="Heading3"/>
+        <w:keepNext/>
+      </w:pPr>
+      <w:r>
+        <w:t>Develop testable possibilities</w:t>
+      </w:r>
+    </w:p>
+    <w:p>
+      <w:r>
+        <w:t>Connect possible biological explanations to observations they might account for. Record assumptions and alternative explanations. Specify what further observation, analysis or specialist review could support or weaken each possibility.</w:t>
+      </w:r>
+    </w:p>
+    <w:p>
+      <w:pPr>
+        <w:pStyle w:val="Heading3"/>
+        <w:keepNext/>
+      </w:pPr>
+      <w:r>
+        <w:t>Plan and examine additional work</w:t>
+      </w:r>
+    </w:p>
+    <w:p>
+      <w:r>
+        <w:t>When new work is justified, link the research question to a proposed method, any specimen or dataset, controls, handling history, measurement and quality information. Evaluate positive, negative, unexpected and inconclusive results in light of those details rather than treating a test label as a complete answer.</w:t>
+      </w:r>
+    </w:p>
+    <w:p>
+      <w:pPr>
+        <w:pStyle w:val="Heading3"/>
+        <w:keepNext/>
+      </w:pPr>
+      <w:r>
+        <w:t>Report and continue</w:t>
+      </w:r>
+    </w:p>
+    <w:p>
+      <w:r>
+        <w:t>A case account should distinguish the participant’s experience, observed evidence, laboratory findings, interpretation and unanswered questions. It should show what was learned, what remains uncertain and what next investigation would be meaningful.</w:t>
+      </w:r>
+    </w:p>
+    <w:p>
+      <w:pPr>
+        <w:pStyle w:val="Heading2"/>
+        <w:keepNext/>
+      </w:pPr>
+      <w:r>
+        <w:t>People and health information</w:t>
+      </w:r>
+    </w:p>
+    <w:p>
+      <w:r>
+        <w:t>A later participant-facing system would need to separate identity and contact details from research analysis where appropriate, restrict access by purpose, record consent or other lawful authority, and allow the participant to understand how information and samples are used. Study-specific ethical review and privacy governance must be settled before Warrigal is used to collect real participant health information.</w:t>
+      </w:r>
+    </w:p>
+    <w:p>
+      <w:r>
+        <w:t>The practical design includes controlled access, traceable changes, secure storage, retention and withdrawal rules, and an account of what can be shared with researchers, laboratories or clinicians. These are part of making research trustworthy, not a substitute for the scientific work.</w:t>
+      </w:r>
+    </w:p>
+    <w:p>
+      <w:pPr>
+        <w:pStyle w:val="Heading2"/>
+        <w:keepNext/>
+      </w:pPr>
+      <w:r>
+        <w:t>Future reference laboratory</w:t>
+      </w:r>
+    </w:p>
+    <w:p>
+      <w:r>
+        <w:t>The reference laboratory is a long-term capability connected to the human health research pathway. A specialist reference laboratory is a useful point of reference for expertise and reproducible methods, but Warrigal’s eventual remit should be defined by its own research questions and collaborators rather than copied from another organisation.</w:t>
+      </w:r>
+    </w:p>
+    <w:p>
+      <w:r>
+        <w:t>A future laboratory or laboratory partnership could investigate a defined biological question arising from a case or research programme; examine specimens using appropriate documented methods; evaluate testing approaches; and retain sample identity, handling history, controls, quality records, raw findings and interpretation. Warrigal would connect each result to the consent, research question, sample, method and review behind it.</w:t>
+      </w:r>
+    </w:p>
+    <w:p>
+      <w:r>
+        <w:t>There is a staged path: first build a sound research and case-study workspace; then work with qualified researchers, clinicians and established laboratories on defined questions; and only later consider whether an independent reference laboratory is justified. A research laboratory, a specialist testing partnership and a clinical pathology service are distinct undertakings. Any patient-care or diagnostic role would need to be defined and governed separately.</w:t>
+      </w:r>
+    </w:p>
+    <w:p>
+      <w:pPr>
+        <w:pStyle w:val="Heading2"/>
+        <w:keepNext/>
+      </w:pPr>
+      <w:r>
+        <w:t>Creation path for the health area</w:t>
+      </w:r>
+    </w:p>
+    <w:p>
+      <w:r>
+        <w:t>Begin with a human health research project using published material and non-identifiable example data. Demonstrate a question moving among biological levels, competing explanations, methods and a source-grounded report.</w:t>
+      </w:r>
+    </w:p>
+    <w:p>
+      <w:r>
+        <w:t>Next, define the case-study and laboratory research records: what a case contains, how authority and access are recorded, how specimens and assays would be linked, and how uncertainty and quality problems appear in a result. Test the design before handling real participant information.</w:t>
+      </w:r>
+    </w:p>
+    <w:p>
+      <w:r>
+        <w:t>Use collaborations and specific studies to learn which laboratory and participant workflows are genuinely needed. The possibility of a reference laboratory remains visible in the suite’s direction without claiming that a facility, accredited testing service or clinical pathway already exists.</w:t>
+      </w:r>
+    </w:p>
+    <w:p>
+      <w:pPr>
+        <w:pStyle w:val="Heading1"/>
+        <w:keepNext/>
+      </w:pPr>
+      <w:r>
+        <w:t>6 Mathematical, sequence, audio and visual tools</w:t>
       </w:r>
     </w:p>
     <w:p>
@@ -339,7 +640,7 @@
         <w:keepNext/>
       </w:pPr>
       <w:r>
-        <w:t>6 Evidence exploration and research intelligence</w:t>
+        <w:t>7 Evidence exploration and research intelligence</w:t>
       </w:r>
     </w:p>
     <w:p>
@@ -358,7 +659,7 @@
         <w:keepNext/>
       </w:pPr>
       <w:r>
-        <w:t>7 Publishing and communication</w:t>
+        <w:t>8 Publishing and communication</w:t>
       </w:r>
     </w:p>
     <w:p>
@@ -377,7 +678,7 @@
         <w:keepNext/>
       </w:pPr>
       <w:r>
-        <w:t>8 Project work and collaboration</w:t>
+        <w:t>9 Project work and collaboration</w:t>
       </w:r>
     </w:p>
     <w:p>
@@ -401,7 +702,7 @@
         <w:keepNext/>
       </w:pPr>
       <w:r>
-        <w:t>9 Relationship to JUFE and other systems</w:t>
+        <w:t>10 Relationship to JUFE and other systems</w:t>
       </w:r>
     </w:p>
     <w:p>
@@ -420,7 +721,7 @@
         <w:keepNext/>
       </w:pPr>
       <w:r>
-        <w:t>10 What exists and what remains to be created</w:t>
+        <w:t>11 What exists and what remains to be created</w:t>
       </w:r>
     </w:p>
     <w:p>
@@ -468,7 +769,7 @@
         <w:pStyle w:val="ListBullet"/>
       </w:pPr>
       <w:r>
-        <w:t>Authenticated Community comments: collector code pushed after controlled validation; four earlier stored passages need attribution repair, and the full campaign has not run.</w:t>
+        <w:t>Authenticated Community comments: collector repaired and uses a separate acquisition browser profile. The four canonical records were repaired and verified. Validation passed 111 focused tests and 375 full-suite tests. Independent review of the CDP transport and CLI wiring found no blocking code defects. The 27-post campaign completed execution with 2 posts complete and 25 incomplete. Empty captures alone do not establish a collector defect. The traced cross-post attribution issue remains a separate unresolved remediation.</w:t>
       </w:r>
     </w:p>
     <w:p>
@@ -482,7 +783,7 @@
         <w:keepNext/>
       </w:pPr>
       <w:r>
-        <w:t>11 Creation path</w:t>
+        <w:t>12 Creation path</w:t>
       </w:r>
     </w:p>
     <w:p>

</xml_diff>